<commit_message>
feat: inject placeholders in Form 1 template, extract House No. in parser, and replace date dynamically
</commit_message>
<xml_diff>
--- a/patentform-backend-main/demo/src/main/resources/Form1_Template.docx
+++ b/patentform-backend-main/demo/src/main/resources/Form1_Template.docx
@@ -1388,6 +1388,9 @@
                 <w:sz w:val="24"/>
               </w:rPr>
             </w:pPr>
+            <w:r>
+              <w:t>{{APP_NAME}}</w:t>
+            </w:r>
           </w:p>
         </w:tc>
         <w:tc>
@@ -1402,6 +1405,9 @@
                 <w:sz w:val="24"/>
               </w:rPr>
             </w:pPr>
+            <w:r>
+              <w:t>{{NATIONALITY}}</w:t>
+            </w:r>
           </w:p>
         </w:tc>
         <w:tc>
@@ -1421,6 +1427,9 @@
                 <w:sz w:val="24"/>
               </w:rPr>
             </w:pPr>
+            <w:r>
+              <w:t>{{RES_CO}}</w:t>
+            </w:r>
           </w:p>
         </w:tc>
         <w:tc>
@@ -1466,6 +1475,9 @@
                 <w:sz w:val="24"/>
               </w:rPr>
             </w:pPr>
+            <w:r>
+              <w:t>{{HOUSE_NO}}</w:t>
+            </w:r>
           </w:p>
         </w:tc>
       </w:tr>
@@ -1550,6 +1562,9 @@
                 <w:sz w:val="24"/>
               </w:rPr>
             </w:pPr>
+            <w:r>
+              <w:t>{{STREET}}</w:t>
+            </w:r>
           </w:p>
         </w:tc>
       </w:tr>
@@ -1634,6 +1649,9 @@
                 <w:sz w:val="24"/>
               </w:rPr>
             </w:pPr>
+            <w:r>
+              <w:t>{{CITY}}</w:t>
+            </w:r>
           </w:p>
         </w:tc>
       </w:tr>
@@ -1718,6 +1736,9 @@
                 <w:sz w:val="24"/>
               </w:rPr>
             </w:pPr>
+            <w:r>
+              <w:t>{{STATE}}</w:t>
+            </w:r>
           </w:p>
         </w:tc>
       </w:tr>
@@ -1802,6 +1823,9 @@
                 <w:sz w:val="24"/>
               </w:rPr>
             </w:pPr>
+            <w:r>
+              <w:t>{{COUNTRY}}</w:t>
+            </w:r>
           </w:p>
         </w:tc>
       </w:tr>
@@ -1899,6 +1923,9 @@
                 <w:sz w:val="24"/>
               </w:rPr>
             </w:pPr>
+            <w:r>
+              <w:t>{{PINCODE}}</w:t>
+            </w:r>
           </w:p>
         </w:tc>
       </w:tr>
@@ -3150,6 +3177,9 @@
                 <w:sz w:val="24"/>
               </w:rPr>
             </w:pPr>
+            <w:r>
+              <w:t>{{INV_NAME}}</w:t>
+            </w:r>
           </w:p>
         </w:tc>
         <w:tc>
@@ -3164,6 +3194,9 @@
                 <w:sz w:val="24"/>
               </w:rPr>
             </w:pPr>
+            <w:r>
+              <w:t>{{INV_NAT}}</w:t>
+            </w:r>
           </w:p>
         </w:tc>
         <w:tc>
@@ -3180,6 +3213,9 @@
                 <w:sz w:val="24"/>
               </w:rPr>
             </w:pPr>
+            <w:r>
+              <w:t>{{INV_COUNTRY}}</w:t>
+            </w:r>
           </w:p>
         </w:tc>
         <w:tc>
@@ -3211,6 +3247,13 @@
                 <w:sz w:val="24"/>
               </w:rPr>
               <w:t>No</w:t>
+            </w:r>
+          </w:p>
+        </w:tc>
+        <w:tc>
+          <w:p>
+            <w:r>
+              <w:t>{{INV_HOUSE_NO}}</w:t>
             </w:r>
           </w:p>
         </w:tc>
@@ -3282,6 +3325,13 @@
             </w:r>
           </w:p>
         </w:tc>
+        <w:tc>
+          <w:p>
+            <w:r>
+              <w:t>{{INV_STREET}}</w:t>
+            </w:r>
+          </w:p>
+        </w:tc>
       </w:tr>
       <w:tr>
         <w:trPr>
@@ -3350,6 +3400,13 @@
             </w:r>
           </w:p>
         </w:tc>
+        <w:tc>
+          <w:p>
+            <w:r>
+              <w:t>{{INV_CITY}}</w:t>
+            </w:r>
+          </w:p>
+        </w:tc>
       </w:tr>
       <w:tr>
         <w:trPr>
@@ -3418,6 +3475,13 @@
             </w:r>
           </w:p>
         </w:tc>
+        <w:tc>
+          <w:p>
+            <w:r>
+              <w:t>{{INV_STATE}}</w:t>
+            </w:r>
+          </w:p>
+        </w:tc>
       </w:tr>
       <w:tr>
         <w:trPr>
@@ -3486,6 +3550,13 @@
             </w:r>
           </w:p>
         </w:tc>
+        <w:tc>
+          <w:p>
+            <w:r>
+              <w:t>{{INV_COUNTRY_ADDR}}</w:t>
+            </w:r>
+          </w:p>
+        </w:tc>
       </w:tr>
       <w:tr>
         <w:trPr>
@@ -3567,6 +3638,13 @@
             </w:r>
           </w:p>
         </w:tc>
+        <w:tc>
+          <w:p>
+            <w:r>
+              <w:t>{{INV_PIN}}</w:t>
+            </w:r>
+          </w:p>
+        </w:tc>
       </w:tr>
       <w:tr>
         <w:trPr>
@@ -3669,6 +3747,9 @@
                 <w:sz w:val="24"/>
               </w:rPr>
             </w:pPr>
+            <w:r>
+              <w:t>{{TITLE}}</w:t>
+            </w:r>
           </w:p>
         </w:tc>
       </w:tr>
@@ -4100,6 +4181,9 @@
                 <w:sz w:val="24"/>
               </w:rPr>
             </w:pPr>
+            <w:r>
+              <w:t>{{SERVICE_NAME}}</w:t>
+            </w:r>
           </w:p>
         </w:tc>
       </w:tr>
@@ -4166,6 +4250,9 @@
                 <w:sz w:val="24"/>
               </w:rPr>
             </w:pPr>
+            <w:r>
+              <w:t>{{SERVICE_ADDRESS}}</w:t>
+            </w:r>
           </w:p>
         </w:tc>
       </w:tr>
@@ -4232,6 +4319,9 @@
                 <w:sz w:val="24"/>
               </w:rPr>
             </w:pPr>
+            <w:r>
+              <w:t>{{SERVICE_TEL}}</w:t>
+            </w:r>
           </w:p>
         </w:tc>
       </w:tr>
@@ -4298,6 +4388,9 @@
                 <w:sz w:val="24"/>
               </w:rPr>
             </w:pPr>
+            <w:r>
+              <w:t>{{SERVICE_MOBILE}}</w:t>
+            </w:r>
           </w:p>
         </w:tc>
       </w:tr>
@@ -4364,6 +4457,9 @@
                 <w:sz w:val="24"/>
               </w:rPr>
             </w:pPr>
+            <w:r>
+              <w:t>{{SERVICE_FAX}}</w:t>
+            </w:r>
           </w:p>
         </w:tc>
       </w:tr>
@@ -4430,6 +4526,9 @@
                 <w:sz w:val="24"/>
               </w:rPr>
             </w:pPr>
+            <w:r>
+              <w:t>{{SERVICE_EMAIL}}</w:t>
+            </w:r>
           </w:p>
         </w:tc>
       </w:tr>

</xml_diff>

<commit_message>
fix: adjust inventor address column widths in Form 1 template and map Principal Name to Service Name
</commit_message>
<xml_diff>
--- a/patentform-backend-main/demo/src/main/resources/Form1_Template.docx
+++ b/patentform-backend-main/demo/src/main/resources/Form1_Template.docx
@@ -3220,7 +3220,7 @@
         </w:tc>
         <w:tc>
           <w:tcPr>
-            <w:tcW w:w="2904" w:type="dxa"/>
+            <w:tcW w:w="1437" w:type="dxa"/>
             <w:gridSpan w:val="7"/>
           </w:tcPr>
           <w:p>
@@ -3251,6 +3251,9 @@
           </w:p>
         </w:tc>
         <w:tc>
+          <w:tcPr>
+            <w:tcW w:w="1467" w:type="dxa"/>
+          </w:tcPr>
           <w:p>
             <w:r>
               <w:t>{{INV_HOUSE_NO}}</w:t>
@@ -3308,7 +3311,7 @@
         </w:tc>
         <w:tc>
           <w:tcPr>
-            <w:tcW w:w="2904" w:type="dxa"/>
+            <w:tcW w:w="1437" w:type="dxa"/>
             <w:gridSpan w:val="7"/>
           </w:tcPr>
           <w:p>
@@ -3326,6 +3329,9 @@
           </w:p>
         </w:tc>
         <w:tc>
+          <w:tcPr>
+            <w:tcW w:w="1467" w:type="dxa"/>
+          </w:tcPr>
           <w:p>
             <w:r>
               <w:t>{{INV_STREET}}</w:t>
@@ -3383,7 +3389,7 @@
         </w:tc>
         <w:tc>
           <w:tcPr>
-            <w:tcW w:w="2904" w:type="dxa"/>
+            <w:tcW w:w="1437" w:type="dxa"/>
             <w:gridSpan w:val="7"/>
           </w:tcPr>
           <w:p>
@@ -3401,6 +3407,9 @@
           </w:p>
         </w:tc>
         <w:tc>
+          <w:tcPr>
+            <w:tcW w:w="1467" w:type="dxa"/>
+          </w:tcPr>
           <w:p>
             <w:r>
               <w:t>{{INV_CITY}}</w:t>
@@ -3458,7 +3467,7 @@
         </w:tc>
         <w:tc>
           <w:tcPr>
-            <w:tcW w:w="2904" w:type="dxa"/>
+            <w:tcW w:w="1437" w:type="dxa"/>
             <w:gridSpan w:val="7"/>
           </w:tcPr>
           <w:p>
@@ -3476,6 +3485,9 @@
           </w:p>
         </w:tc>
         <w:tc>
+          <w:tcPr>
+            <w:tcW w:w="1467" w:type="dxa"/>
+          </w:tcPr>
           <w:p>
             <w:r>
               <w:t>{{INV_STATE}}</w:t>
@@ -3533,7 +3545,7 @@
         </w:tc>
         <w:tc>
           <w:tcPr>
-            <w:tcW w:w="2904" w:type="dxa"/>
+            <w:tcW w:w="1437" w:type="dxa"/>
             <w:gridSpan w:val="7"/>
           </w:tcPr>
           <w:p>
@@ -3551,6 +3563,9 @@
           </w:p>
         </w:tc>
         <w:tc>
+          <w:tcPr>
+            <w:tcW w:w="1467" w:type="dxa"/>
+          </w:tcPr>
           <w:p>
             <w:r>
               <w:t>{{INV_COUNTRY_ADDR}}</w:t>
@@ -3608,7 +3623,7 @@
         </w:tc>
         <w:tc>
           <w:tcPr>
-            <w:tcW w:w="2904" w:type="dxa"/>
+            <w:tcW w:w="1437" w:type="dxa"/>
             <w:gridSpan w:val="7"/>
           </w:tcPr>
           <w:p>
@@ -3639,6 +3654,9 @@
           </w:p>
         </w:tc>
         <w:tc>
+          <w:tcPr>
+            <w:tcW w:w="1467" w:type="dxa"/>
+          </w:tcPr>
           <w:p>
             <w:r>
               <w:t>{{INV_PIN}}</w:t>

</xml_diff>